<commit_message>
docs: rename FlexServer to FlexCompute Server across all docs and diagrams
</commit_message>
<xml_diff>
--- a/XRComm_FCS_platform/8T8R_Quickstart.docx
+++ b/XRComm_FCS_platform/8T8R_Quickstart.docx
@@ -159,7 +159,7 @@
                 <w:bCs/>
                 <w:b/>
               </w:rPr>
-              <w:t xml:space="preserve">FlexServer</w:t>
+              <w:t xml:space="preserve">FlexCompute Server</w:t>
             </w:r>
           </w:p>
         </w:tc>
@@ -201,7 +201,7 @@
               <w:jc w:val="left"/>
             </w:pPr>
             <w:r>
-              <w:t xml:space="preserve">Any machine (including the FlexServer itself) from which you run the Python gRPC control client to operate the platform.</w:t>
+              <w:t xml:space="preserve">Any machine (including the FlexCompute Server itself) from which you run the Python gRPC control client to operate the platform.</w:t>
             </w:r>
           </w:p>
         </w:tc>
@@ -501,7 +501,7 @@
         <w:pStyle w:val="FirstParagraph"/>
       </w:pPr>
       <w:r>
-        <w:t xml:space="preserve">The platform operates as a set of background services on the FlexServer. Remote or local clients can control the platform over the network using a Python gRPC client.</w:t>
+        <w:t xml:space="preserve">The platform operates as a set of background services on the FlexCompute Server. Remote or local clients can control the platform over the network using a Python gRPC client.</w:t>
       </w:r>
     </w:p>
     <w:p>
@@ -701,7 +701,7 @@
         <w:t xml:space="preserve"> </w:t>
       </w:r>
       <w:r>
-        <w:t xml:space="preserve">or on the FlexServer itself) connects to the Control Service over TCP port 50051.</w:t>
+        <w:t xml:space="preserve">or on the FlexCompute Server itself) connects to the Control Service over TCP port 50051.</w:t>
       </w:r>
     </w:p>
     <w:bookmarkEnd w:id="21"/>
@@ -1111,7 +1111,7 @@
         <w:pStyle w:val="FirstParagraph"/>
       </w:pPr>
       <w:r>
-        <w:t xml:space="preserve">Transfer the tarball to your FlexServer and extract it:</w:t>
+        <w:t xml:space="preserve">Transfer the tarball to your FlexCompute Server and extract it:</w:t>
       </w:r>
     </w:p>
     <w:p>
@@ -1841,7 +1841,7 @@
         <w:t xml:space="preserve">Client Machine</w:t>
       </w:r>
       <w:r>
-        <w:t xml:space="preserve">) that has network access to the FlexServer:</w:t>
+        <w:t xml:space="preserve">) that has network access to the FlexCompute Server:</w:t>
       </w:r>
     </w:p>
     <w:p>
@@ -1857,7 +1857,7 @@
           <w:bCs/>
           <w:b/>
         </w:rPr>
-        <w:t xml:space="preserve">From the FlexServer itself</w:t>
+        <w:t xml:space="preserve">From the FlexCompute Server itself</w:t>
       </w:r>
       <w:r>
         <w:t xml:space="preserve"> </w:t>
@@ -1957,7 +1957,7 @@
         <w:pStyle w:val="FirstParagraph"/>
       </w:pPr>
       <w:r>
-        <w:t xml:space="preserve">The installer already generates the protobuf Python bindings on the FlexServer. If you are setting up the client on a separate machine, copy the</w:t>
+        <w:t xml:space="preserve">The installer already generates the protobuf Python bindings on the FlexCompute Server. If you are setting up the client on a separate machine, copy the</w:t>
       </w:r>
       <w:r>
         <w:t xml:space="preserve"> </w:t>
@@ -2200,7 +2200,7 @@
         <w:t xml:space="preserve"> </w:t>
       </w:r>
       <w:r>
-        <w:t xml:space="preserve">with the IP address of your FlexServer (use</w:t>
+        <w:t xml:space="preserve">with the IP address of your FlexCompute Server (use</w:t>
       </w:r>
       <w:r>
         <w:t xml:space="preserve"> </w:t>
@@ -3069,7 +3069,7 @@
         <w:t xml:space="preserve">xrcomm_playback</w:t>
       </w:r>
       <w:r>
-        <w:t xml:space="preserve">) streams raw IQ signal data at full line-rate (up to two 100 GbE ports simultaneously). To prevent host resource contention (such as CPU scheduling latency, memory bus saturation, or PCIe contention) with the receiver platform on the FlexServer,</w:t>
+        <w:t xml:space="preserve">) streams raw IQ signal data at full line-rate (up to two 100 GbE ports simultaneously). To prevent host resource contention (such as CPU scheduling latency, memory bus saturation, or PCIe contention) with the receiver platform on the FlexCompute Server,</w:t>
       </w:r>
       <w:r>
         <w:t xml:space="preserve"> </w:t>
@@ -3082,7 +3082,7 @@
         <w:t xml:space="preserve">the Playback Engine must be executed on a separate physical server</w:t>
       </w:r>
       <w:r>
-        <w:t xml:space="preserve">. The Playback Server is cabled directly via high-speed fiber to the FlexServer’s receive NIC. Do not run the playback engine on the FlexServer in production.</w:t>
+        <w:t xml:space="preserve">. The Playback Server is cabled directly via high-speed fiber to the FlexCompute Server’s receive NIC. Do not run the playback engine on the FlexCompute Server in production.</w:t>
       </w:r>
     </w:p>
     <w:bookmarkEnd w:id="33"/>
@@ -4865,7 +4865,7 @@
         <w:t xml:space="preserve"> </w:t>
       </w:r>
       <w:r>
-        <w:t xml:space="preserve">for the FlexServer. They are typically set up once during initial server provisioning. If the platform fails to start or behaves unexpectedly, verify these settings first.</w:t>
+        <w:t xml:space="preserve">for the FlexCompute Server. They are typically set up once during initial server provisioning. If the platform fails to start or behaves unexpectedly, verify these settings first.</w:t>
       </w:r>
     </w:p>
     <w:bookmarkStart w:id="45" w:name="dependency-version-check-table"/>

</xml_diff>